<commit_message>
feat: complete phase 10 delivery validation
</commit_message>
<xml_diff>
--- a/docs/superpowers/specs/2026-07-16-engineering-management-system-design.docx
+++ b/docs/superpowers/specs/2026-07-16-engineering-management-system-design.docx
@@ -9718,6 +9718,708 @@
         <w:t>阶段 10 输出部署包、数据库迁移说明、备份恢复说明和 Windows Server + IIS 部署手册，不实际部署生产服务器。</w:t>
       </w:r>
     </w:p>
+    <w:p>
+      <w:pPr>
+        <w:sectPr>
+          <w:pgSz w:w="12240" w:h="15840"/>
+          <w:pgMar w:top="1247" w:right="1247" w:bottom="1134" w:left="1361" w:header="720" w:footer="720" w:gutter="0"/>
+          <w:cols w:space="720"/>
+          <w:docGrid w:linePitch="360"/>
+        </w:sectPr>
+      </w:pPr>
+    </w:p>
+    <w:p>
+      <w:pPr>
+        <w:pStyle w:val="Heading1"/>
+      </w:pPr>
+      <w:r>
+        <w:rPr>
+          <w:rFonts w:ascii="Microsoft YaHei" w:hAnsi="Microsoft YaHei" w:eastAsia="Microsoft YaHei"/>
+        </w:rPr>
+        <w:t>30. 实施完成与交付证据</w:t>
+      </w:r>
+    </w:p>
+    <w:p>
+      <w:pPr>
+        <w:pStyle w:val="ListBullet"/>
+      </w:pPr>
+      <w:r>
+        <w:rPr>
+          <w:rFonts w:ascii="Microsoft YaHei" w:hAnsi="Microsoft YaHei" w:eastAsia="Microsoft YaHei"/>
+        </w:rPr>
+        <w:t>阶段 0～10 已于 2026-07-17 按分阶段计划完成；阶段 9 和阶段 10 均在当前功能分支本地提交，不推送远端。</w:t>
+      </w:r>
+    </w:p>
+    <w:p>
+      <w:pPr>
+        <w:pStyle w:val="ListBullet"/>
+      </w:pPr>
+      <w:r>
+        <w:rPr>
+          <w:rFonts w:ascii="Microsoft YaHei" w:hAnsi="Microsoft YaHei" w:eastAsia="Microsoft YaHei"/>
+        </w:rPr>
+        <w:t xml:space="preserve">Development 使用唯一持久化测试库 </w:t>
+      </w:r>
+      <w:r>
+        <w:rPr>
+          <w:rFonts w:ascii="Consolas" w:hAnsi="Consolas" w:eastAsia="Consolas"/>
+          <w:color w:val="374151"/>
+          <w:sz w:val="18"/>
+        </w:rPr>
+        <w:t>EngineeringManager_Test</w:t>
+      </w:r>
+      <w:r>
+        <w:rPr>
+          <w:rFonts w:ascii="Microsoft YaHei" w:hAnsi="Microsoft YaHei" w:eastAsia="Microsoft YaHei"/>
+        </w:rPr>
+        <w:t>；所有迁移已应用，EF 检查无待迁移模型变化。测试库在实际生产部署确认后再人工删除。</w:t>
+      </w:r>
+    </w:p>
+    <w:p>
+      <w:pPr>
+        <w:pStyle w:val="ListBullet"/>
+      </w:pPr>
+      <w:r>
+        <w:rPr>
+          <w:rFonts w:ascii="Microsoft YaHei" w:hAnsi="Microsoft YaHei" w:eastAsia="Microsoft YaHei"/>
+        </w:rPr>
+        <w:t>最终质量门禁执行 restore、Release build、223 项自动化测试和 Release publish：0 警告、0 错误、0 失败，</w:t>
+      </w:r>
+      <w:r>
+        <w:rPr>
+          <w:rFonts w:ascii="Consolas" w:hAnsi="Consolas" w:eastAsia="Consolas"/>
+          <w:color w:val="374151"/>
+          <w:sz w:val="18"/>
+        </w:rPr>
+        <w:t>QUALITY_GATE=PASS</w:t>
+      </w:r>
+      <w:r>
+        <w:rPr>
+          <w:rFonts w:ascii="Microsoft YaHei" w:hAnsi="Microsoft YaHei" w:eastAsia="Microsoft YaHei"/>
+        </w:rPr>
+        <w:t>。</w:t>
+      </w:r>
+    </w:p>
+    <w:p>
+      <w:pPr>
+        <w:pStyle w:val="ListBullet"/>
+      </w:pPr>
+      <w:r>
+        <w:rPr>
+          <w:rFonts w:ascii="Microsoft YaHei" w:hAnsi="Microsoft YaHei" w:eastAsia="Microsoft YaHei"/>
+        </w:rPr>
+        <w:t>代表性性能基线覆盖 100 个项目、500 名员工、200 台设备和 10,000 条设备使用记录，常用列表预热后联合查询低于 2 秒；该结果不代表生产并发容量。</w:t>
+      </w:r>
+    </w:p>
+    <w:p>
+      <w:pPr>
+        <w:pStyle w:val="ListBullet"/>
+      </w:pPr>
+      <w:r>
+        <w:rPr>
+          <w:rFonts w:ascii="Microsoft YaHei" w:hAnsi="Microsoft YaHei" w:eastAsia="Microsoft YaHei"/>
+        </w:rPr>
+        <w:t>SQL Server 测试库 CHECKSUM 备份、临时库恢复、迁移历史/核心数据核对和临时库清理均实际通过；附件 ZIP 同步生成。</w:t>
+      </w:r>
+    </w:p>
+    <w:p>
+      <w:pPr>
+        <w:pStyle w:val="ListBullet"/>
+      </w:pPr>
+      <w:r>
+        <w:rPr>
+          <w:rFonts w:ascii="Microsoft YaHei" w:hAnsi="Microsoft YaHei" w:eastAsia="Microsoft YaHei"/>
+        </w:rPr>
+        <w:t xml:space="preserve">测试管理员与样例数据只能在 Development + </w:t>
+      </w:r>
+      <w:r>
+        <w:rPr>
+          <w:rFonts w:ascii="Consolas" w:hAnsi="Consolas" w:eastAsia="Consolas"/>
+          <w:color w:val="374151"/>
+          <w:sz w:val="18"/>
+        </w:rPr>
+        <w:t>_Test</w:t>
+      </w:r>
+      <w:r>
+        <w:rPr>
+          <w:rFonts w:ascii="Microsoft YaHei" w:hAnsi="Microsoft YaHei" w:eastAsia="Microsoft YaHei"/>
+        </w:rPr>
+        <w:t xml:space="preserve"> 数据库且显式开启时生成，凭据只写入 Git 忽略文件。</w:t>
+      </w:r>
+    </w:p>
+    <w:p>
+      <w:pPr>
+        <w:pStyle w:val="ListBullet"/>
+      </w:pPr>
+      <w:r>
+        <w:rPr>
+          <w:rFonts w:ascii="Microsoft YaHei" w:hAnsi="Microsoft YaHei" w:eastAsia="Microsoft YaHei"/>
+        </w:rPr>
+        <w:t>真实浏览器验证登录、设备总览、设备现场离线页、桌面和 390px 手机布局，未发现横向溢出或控制台警告/错误。</w:t>
+      </w:r>
+    </w:p>
+    <w:p>
+      <w:pPr>
+        <w:pStyle w:val="ListBullet"/>
+      </w:pPr>
+      <w:r>
+        <w:rPr>
+          <w:rFonts w:ascii="Consolas" w:hAnsi="Consolas" w:eastAsia="Consolas"/>
+          <w:color w:val="374151"/>
+          <w:sz w:val="18"/>
+        </w:rPr>
+        <w:t>artifacts/publish</w:t>
+      </w:r>
+      <w:r>
+        <w:rPr>
+          <w:rFonts w:ascii="Microsoft YaHei" w:hAnsi="Microsoft YaHei" w:eastAsia="Microsoft YaHei"/>
+        </w:rPr>
+        <w:t xml:space="preserve"> 为本地 Release 发布包；部署手册和检查清单已就绪，但未连接生产服务器、未操作生产数据库、未配置正式域名/TLS。</w:t>
+      </w:r>
+    </w:p>
+    <w:p>
+      <w:pPr>
+        <w:pStyle w:val="Heading2"/>
+      </w:pPr>
+      <w:r>
+        <w:rPr>
+          <w:rFonts w:ascii="Microsoft YaHei" w:hAnsi="Microsoft YaHei" w:eastAsia="Microsoft YaHei"/>
+        </w:rPr>
+        <w:t>30.1 完成证据表</w:t>
+      </w:r>
+    </w:p>
+    <w:tbl>
+      <w:tblPr>
+        <w:tblStyle w:val="TableGrid"/>
+        <w:tblW w:type="auto" w:w="0"/>
+        <w:tblLook w:firstColumn="1" w:firstRow="1" w:lastColumn="0" w:lastRow="0" w:noHBand="0" w:noVBand="1" w:val="04A0"/>
+      </w:tblPr>
+      <w:tblGrid>
+        <w:gridCol w:w="3211"/>
+        <w:gridCol w:w="3211"/>
+        <w:gridCol w:w="3211"/>
+      </w:tblGrid>
+      <w:tr>
+        <w:tc>
+          <w:tcPr>
+            <w:tcW w:type="dxa" w:w="3211"/>
+            <w:shd w:fill="D9F0EC"/>
+          </w:tcPr>
+          <w:p>
+            <w:r>
+              <w:rPr>
+                <w:rFonts w:ascii="Microsoft YaHei" w:hAnsi="Microsoft YaHei" w:eastAsia="Microsoft YaHei"/>
+                <w:b/>
+              </w:rPr>
+              <w:t>设计/计划范围</w:t>
+            </w:r>
+          </w:p>
+        </w:tc>
+        <w:tc>
+          <w:tcPr>
+            <w:tcW w:type="dxa" w:w="3211"/>
+            <w:shd w:fill="D9F0EC"/>
+          </w:tcPr>
+          <w:p>
+            <w:r>
+              <w:rPr>
+                <w:rFonts w:ascii="Microsoft YaHei" w:hAnsi="Microsoft YaHei" w:eastAsia="Microsoft YaHei"/>
+                <w:b/>
+              </w:rPr>
+              <w:t>当前证据</w:t>
+            </w:r>
+          </w:p>
+        </w:tc>
+        <w:tc>
+          <w:tcPr>
+            <w:tcW w:type="dxa" w:w="3211"/>
+            <w:shd w:fill="D9F0EC"/>
+          </w:tcPr>
+          <w:p>
+            <w:r>
+              <w:rPr>
+                <w:rFonts w:ascii="Microsoft YaHei" w:hAnsi="Microsoft YaHei" w:eastAsia="Microsoft YaHei"/>
+                <w:b/>
+              </w:rPr>
+              <w:t>结论</w:t>
+            </w:r>
+          </w:p>
+        </w:tc>
+      </w:tr>
+      <w:tr>
+        <w:tc>
+          <w:tcPr>
+            <w:tcW w:type="dxa" w:w="3211"/>
+          </w:tcPr>
+          <w:p>
+            <w:r>
+              <w:rPr>
+                <w:rFonts w:ascii="Microsoft YaHei" w:hAnsi="Microsoft YaHei" w:eastAsia="Microsoft YaHei"/>
+              </w:rPr>
+              <w:t>第 21 节分阶段开发与持续进度</w:t>
+            </w:r>
+          </w:p>
+        </w:tc>
+        <w:tc>
+          <w:tcPr>
+            <w:tcW w:type="dxa" w:w="3211"/>
+          </w:tcPr>
+          <w:p>
+            <w:r>
+              <w:rPr>
+                <w:rFonts w:ascii="Microsoft YaHei" w:hAnsi="Microsoft YaHei" w:eastAsia="Microsoft YaHei"/>
+              </w:rPr>
+              <w:t xml:space="preserve">阶段计划文件、单一 </w:t>
+            </w:r>
+            <w:r>
+              <w:rPr>
+                <w:rFonts w:ascii="Consolas" w:hAnsi="Consolas" w:eastAsia="Consolas"/>
+                <w:color w:val="374151"/>
+                <w:sz w:val="18"/>
+              </w:rPr>
+              <w:t>docs/开发进度.md</w:t>
+            </w:r>
+            <w:r>
+              <w:rPr>
+                <w:rFonts w:ascii="Microsoft YaHei" w:hAnsi="Microsoft YaHei" w:eastAsia="Microsoft YaHei"/>
+              </w:rPr>
+              <w:t>、阶段 7～9 本地提交及阶段 10 待提交差异</w:t>
+            </w:r>
+          </w:p>
+        </w:tc>
+        <w:tc>
+          <w:tcPr>
+            <w:tcW w:type="dxa" w:w="3211"/>
+          </w:tcPr>
+          <w:p>
+            <w:r>
+              <w:rPr>
+                <w:rFonts w:ascii="Microsoft YaHei" w:hAnsi="Microsoft YaHei" w:eastAsia="Microsoft YaHei"/>
+              </w:rPr>
+              <w:t>已完成</w:t>
+            </w:r>
+          </w:p>
+        </w:tc>
+      </w:tr>
+      <w:tr>
+        <w:tc>
+          <w:tcPr>
+            <w:tcW w:type="dxa" w:w="3211"/>
+          </w:tcPr>
+          <w:p>
+            <w:r>
+              <w:rPr>
+                <w:rFonts w:ascii="Microsoft YaHei" w:hAnsi="Microsoft YaHei" w:eastAsia="Microsoft YaHei"/>
+              </w:rPr>
+              <w:t>第 27 节自有公司</w:t>
+            </w:r>
+          </w:p>
+        </w:tc>
+        <w:tc>
+          <w:tcPr>
+            <w:tcW w:type="dxa" w:w="3211"/>
+          </w:tcPr>
+          <w:p>
+            <w:r>
+              <w:rPr>
+                <w:rFonts w:ascii="Consolas" w:hAnsi="Consolas" w:eastAsia="Consolas"/>
+                <w:color w:val="374151"/>
+                <w:sz w:val="18"/>
+              </w:rPr>
+              <w:t>CompanyManagement</w:t>
+            </w:r>
+            <w:r>
+              <w:rPr>
+                <w:rFonts w:ascii="Microsoft YaHei" w:hAnsi="Microsoft YaHei" w:eastAsia="Microsoft YaHei"/>
+              </w:rPr>
+              <w:t xml:space="preserve"> Migration、公司服务/页面/权限/导入导出/提醒测试及阶段 8 的 190 项门禁</w:t>
+            </w:r>
+          </w:p>
+        </w:tc>
+        <w:tc>
+          <w:tcPr>
+            <w:tcW w:type="dxa" w:w="3211"/>
+          </w:tcPr>
+          <w:p>
+            <w:r>
+              <w:rPr>
+                <w:rFonts w:ascii="Microsoft YaHei" w:hAnsi="Microsoft YaHei" w:eastAsia="Microsoft YaHei"/>
+              </w:rPr>
+              <w:t>已完成</w:t>
+            </w:r>
+          </w:p>
+        </w:tc>
+      </w:tr>
+      <w:tr>
+        <w:tc>
+          <w:tcPr>
+            <w:tcW w:type="dxa" w:w="3211"/>
+          </w:tcPr>
+          <w:p>
+            <w:r>
+              <w:rPr>
+                <w:rFonts w:ascii="Microsoft YaHei" w:hAnsi="Microsoft YaHei" w:eastAsia="Microsoft YaHei"/>
+              </w:rPr>
+              <w:t>第 28 节设备管理</w:t>
+            </w:r>
+          </w:p>
+        </w:tc>
+        <w:tc>
+          <w:tcPr>
+            <w:tcW w:type="dxa" w:w="3211"/>
+          </w:tcPr>
+          <w:p>
+            <w:r>
+              <w:rPr>
+                <w:rFonts w:ascii="Consolas" w:hAnsi="Consolas" w:eastAsia="Consolas"/>
+                <w:color w:val="374151"/>
+                <w:sz w:val="18"/>
+              </w:rPr>
+              <w:t>EquipmentManagement</w:t>
+            </w:r>
+            <w:r>
+              <w:rPr>
+                <w:rFonts w:ascii="Microsoft YaHei" w:hAnsi="Microsoft YaHei" w:eastAsia="Microsoft YaHei"/>
+              </w:rPr>
+              <w:t>、</w:t>
+            </w:r>
+            <w:r>
+              <w:rPr>
+                <w:rFonts w:ascii="Consolas" w:hAnsi="Consolas" w:eastAsia="Consolas"/>
+                <w:color w:val="374151"/>
+                <w:sz w:val="18"/>
+              </w:rPr>
+              <w:t>EquipmentOfflinePhotos</w:t>
+            </w:r>
+            <w:r>
+              <w:rPr>
+                <w:rFonts w:ascii="Microsoft YaHei" w:hAnsi="Microsoft YaHei" w:eastAsia="Microsoft YaHei"/>
+              </w:rPr>
+              <w:t xml:space="preserve">、设备计算/服务/结算/权限/页面/Excel/离线照片测试及阶段 9 提交 </w:t>
+            </w:r>
+            <w:r>
+              <w:rPr>
+                <w:rFonts w:ascii="Consolas" w:hAnsi="Consolas" w:eastAsia="Consolas"/>
+                <w:color w:val="374151"/>
+                <w:sz w:val="18"/>
+              </w:rPr>
+              <w:t>d800bd9</w:t>
+            </w:r>
+          </w:p>
+        </w:tc>
+        <w:tc>
+          <w:tcPr>
+            <w:tcW w:type="dxa" w:w="3211"/>
+          </w:tcPr>
+          <w:p>
+            <w:r>
+              <w:rPr>
+                <w:rFonts w:ascii="Microsoft YaHei" w:hAnsi="Microsoft YaHei" w:eastAsia="Microsoft YaHei"/>
+              </w:rPr>
+              <w:t>已完成</w:t>
+            </w:r>
+          </w:p>
+        </w:tc>
+      </w:tr>
+      <w:tr>
+        <w:tc>
+          <w:tcPr>
+            <w:tcW w:type="dxa" w:w="3211"/>
+          </w:tcPr>
+          <w:p>
+            <w:r>
+              <w:rPr>
+                <w:rFonts w:ascii="Microsoft YaHei" w:hAnsi="Microsoft YaHei" w:eastAsia="Microsoft YaHei"/>
+              </w:rPr>
+              <w:t>第 29 节自动执行与测试库</w:t>
+            </w:r>
+          </w:p>
+        </w:tc>
+        <w:tc>
+          <w:tcPr>
+            <w:tcW w:type="dxa" w:w="3211"/>
+          </w:tcPr>
+          <w:p>
+            <w:r>
+              <w:rPr>
+                <w:rFonts w:ascii="Microsoft YaHei" w:hAnsi="Microsoft YaHei" w:eastAsia="Microsoft YaHei"/>
+              </w:rPr>
+              <w:t xml:space="preserve">Development + </w:t>
+            </w:r>
+            <w:r>
+              <w:rPr>
+                <w:rFonts w:ascii="Consolas" w:hAnsi="Consolas" w:eastAsia="Consolas"/>
+                <w:color w:val="374151"/>
+                <w:sz w:val="18"/>
+              </w:rPr>
+              <w:t>_Test</w:t>
+            </w:r>
+            <w:r>
+              <w:rPr>
+                <w:rFonts w:ascii="Microsoft YaHei" w:hAnsi="Microsoft YaHei" w:eastAsia="Microsoft YaHei"/>
+              </w:rPr>
+              <w:t xml:space="preserve"> 双护栏、随机测试密码忽略文件、</w:t>
+            </w:r>
+            <w:r>
+              <w:rPr>
+                <w:rFonts w:ascii="Consolas" w:hAnsi="Consolas" w:eastAsia="Consolas"/>
+                <w:color w:val="374151"/>
+                <w:sz w:val="18"/>
+              </w:rPr>
+              <w:t>EngineeringManager_Test</w:t>
+            </w:r>
+            <w:r>
+              <w:rPr>
+                <w:rFonts w:ascii="Microsoft YaHei" w:hAnsi="Microsoft YaHei" w:eastAsia="Microsoft YaHei"/>
+              </w:rPr>
+              <w:t>、真实浏览器登录</w:t>
+            </w:r>
+          </w:p>
+        </w:tc>
+        <w:tc>
+          <w:tcPr>
+            <w:tcW w:type="dxa" w:w="3211"/>
+          </w:tcPr>
+          <w:p>
+            <w:r>
+              <w:rPr>
+                <w:rFonts w:ascii="Microsoft YaHei" w:hAnsi="Microsoft YaHei" w:eastAsia="Microsoft YaHei"/>
+              </w:rPr>
+              <w:t>已完成</w:t>
+            </w:r>
+          </w:p>
+        </w:tc>
+      </w:tr>
+      <w:tr>
+        <w:tc>
+          <w:tcPr>
+            <w:tcW w:type="dxa" w:w="3211"/>
+          </w:tcPr>
+          <w:p>
+            <w:r>
+              <w:rPr>
+                <w:rFonts w:ascii="Microsoft YaHei" w:hAnsi="Microsoft YaHei" w:eastAsia="Microsoft YaHei"/>
+              </w:rPr>
+              <w:t>阶段 7 PWA 与图形化</w:t>
+            </w:r>
+          </w:p>
+        </w:tc>
+        <w:tc>
+          <w:tcPr>
+            <w:tcW w:type="dxa" w:w="3211"/>
+          </w:tcPr>
+          <w:p>
+            <w:r>
+              <w:rPr>
+                <w:rFonts w:ascii="Consolas" w:hAnsi="Consolas" w:eastAsia="Consolas"/>
+                <w:color w:val="374151"/>
+                <w:sz w:val="18"/>
+              </w:rPr>
+              <w:t>PwaOfflineDashboard</w:t>
+            </w:r>
+            <w:r>
+              <w:rPr>
+                <w:rFonts w:ascii="Microsoft YaHei" w:hAnsi="Microsoft YaHei" w:eastAsia="Microsoft YaHei"/>
+              </w:rPr>
+              <w:t>、离线幂等/冲突/照片/缓存测试、170 项阶段门禁</w:t>
+            </w:r>
+          </w:p>
+        </w:tc>
+        <w:tc>
+          <w:tcPr>
+            <w:tcW w:type="dxa" w:w="3211"/>
+          </w:tcPr>
+          <w:p>
+            <w:r>
+              <w:rPr>
+                <w:rFonts w:ascii="Microsoft YaHei" w:hAnsi="Microsoft YaHei" w:eastAsia="Microsoft YaHei"/>
+              </w:rPr>
+              <w:t>已完成</w:t>
+            </w:r>
+          </w:p>
+        </w:tc>
+      </w:tr>
+      <w:tr>
+        <w:tc>
+          <w:tcPr>
+            <w:tcW w:type="dxa" w:w="3211"/>
+          </w:tcPr>
+          <w:p>
+            <w:r>
+              <w:rPr>
+                <w:rFonts w:ascii="Microsoft YaHei" w:hAnsi="Microsoft YaHei" w:eastAsia="Microsoft YaHei"/>
+              </w:rPr>
+              <w:t>阶段 8 自有公司</w:t>
+            </w:r>
+          </w:p>
+        </w:tc>
+        <w:tc>
+          <w:tcPr>
+            <w:tcW w:type="dxa" w:w="3211"/>
+          </w:tcPr>
+          <w:p>
+            <w:r>
+              <w:rPr>
+                <w:rFonts w:ascii="Consolas" w:hAnsi="Consolas" w:eastAsia="Consolas"/>
+                <w:color w:val="374151"/>
+                <w:sz w:val="18"/>
+              </w:rPr>
+              <w:t>CompanyManagement</w:t>
+            </w:r>
+            <w:r>
+              <w:rPr>
+                <w:rFonts w:ascii="Microsoft YaHei" w:hAnsi="Microsoft YaHei" w:eastAsia="Microsoft YaHei"/>
+              </w:rPr>
+              <w:t>、公司聚合与 Excel、190 项阶段门禁</w:t>
+            </w:r>
+          </w:p>
+        </w:tc>
+        <w:tc>
+          <w:tcPr>
+            <w:tcW w:type="dxa" w:w="3211"/>
+          </w:tcPr>
+          <w:p>
+            <w:r>
+              <w:rPr>
+                <w:rFonts w:ascii="Microsoft YaHei" w:hAnsi="Microsoft YaHei" w:eastAsia="Microsoft YaHei"/>
+              </w:rPr>
+              <w:t>已完成</w:t>
+            </w:r>
+          </w:p>
+        </w:tc>
+      </w:tr>
+      <w:tr>
+        <w:tc>
+          <w:tcPr>
+            <w:tcW w:type="dxa" w:w="3211"/>
+          </w:tcPr>
+          <w:p>
+            <w:r>
+              <w:rPr>
+                <w:rFonts w:ascii="Microsoft YaHei" w:hAnsi="Microsoft YaHei" w:eastAsia="Microsoft YaHei"/>
+              </w:rPr>
+              <w:t>阶段 9 设备管理</w:t>
+            </w:r>
+          </w:p>
+        </w:tc>
+        <w:tc>
+          <w:tcPr>
+            <w:tcW w:type="dxa" w:w="3211"/>
+          </w:tcPr>
+          <w:p>
+            <w:r>
+              <w:rPr>
+                <w:rFonts w:ascii="Microsoft YaHei" w:hAnsi="Microsoft YaHei" w:eastAsia="Microsoft YaHei"/>
+              </w:rPr>
+              <w:t xml:space="preserve">两个设备 Migration、215 项阶段门禁、HTTP/浏览器验收、本地提交 </w:t>
+            </w:r>
+            <w:r>
+              <w:rPr>
+                <w:rFonts w:ascii="Consolas" w:hAnsi="Consolas" w:eastAsia="Consolas"/>
+                <w:color w:val="374151"/>
+                <w:sz w:val="18"/>
+              </w:rPr>
+              <w:t>d800bd9</w:t>
+            </w:r>
+          </w:p>
+        </w:tc>
+        <w:tc>
+          <w:tcPr>
+            <w:tcW w:type="dxa" w:w="3211"/>
+          </w:tcPr>
+          <w:p>
+            <w:r>
+              <w:rPr>
+                <w:rFonts w:ascii="Microsoft YaHei" w:hAnsi="Microsoft YaHei" w:eastAsia="Microsoft YaHei"/>
+              </w:rPr>
+              <w:t>已完成</w:t>
+            </w:r>
+          </w:p>
+        </w:tc>
+      </w:tr>
+      <w:tr>
+        <w:tc>
+          <w:tcPr>
+            <w:tcW w:type="dxa" w:w="3211"/>
+          </w:tcPr>
+          <w:p>
+            <w:r>
+              <w:rPr>
+                <w:rFonts w:ascii="Microsoft YaHei" w:hAnsi="Microsoft YaHei" w:eastAsia="Microsoft YaHei"/>
+              </w:rPr>
+              <w:t>阶段 10 集成交付</w:t>
+            </w:r>
+          </w:p>
+        </w:tc>
+        <w:tc>
+          <w:tcPr>
+            <w:tcW w:type="dxa" w:w="3211"/>
+          </w:tcPr>
+          <w:p>
+            <w:r>
+              <w:rPr>
+                <w:rFonts w:ascii="Microsoft YaHei" w:hAnsi="Microsoft YaHei" w:eastAsia="Microsoft YaHei"/>
+              </w:rPr>
+              <w:t>223 项最终门禁、10,000 条使用记录性能基线、真实备份恢复、Release publish、IIS 手册</w:t>
+            </w:r>
+          </w:p>
+        </w:tc>
+        <w:tc>
+          <w:tcPr>
+            <w:tcW w:type="dxa" w:w="3211"/>
+          </w:tcPr>
+          <w:p>
+            <w:r>
+              <w:rPr>
+                <w:rFonts w:ascii="Microsoft YaHei" w:hAnsi="Microsoft YaHei" w:eastAsia="Microsoft YaHei"/>
+              </w:rPr>
+              <w:t>已完成</w:t>
+            </w:r>
+          </w:p>
+        </w:tc>
+      </w:tr>
+      <w:tr>
+        <w:tc>
+          <w:tcPr>
+            <w:tcW w:type="dxa" w:w="3211"/>
+          </w:tcPr>
+          <w:p>
+            <w:r>
+              <w:rPr>
+                <w:rFonts w:ascii="Microsoft YaHei" w:hAnsi="Microsoft YaHei" w:eastAsia="Microsoft YaHei"/>
+              </w:rPr>
+              <w:t>真实生产环境</w:t>
+            </w:r>
+          </w:p>
+        </w:tc>
+        <w:tc>
+          <w:tcPr>
+            <w:tcW w:type="dxa" w:w="3211"/>
+          </w:tcPr>
+          <w:p>
+            <w:r>
+              <w:rPr>
+                <w:rFonts w:ascii="Microsoft YaHei" w:hAnsi="Microsoft YaHei" w:eastAsia="Microsoft YaHei"/>
+              </w:rPr>
+              <w:t>部署包和手册已就绪；生产服务器、数据库、域名、TLS 和真实数据仍须在部署窗口由用户提供并执行</w:t>
+            </w:r>
+          </w:p>
+        </w:tc>
+        <w:tc>
+          <w:tcPr>
+            <w:tcW w:type="dxa" w:w="3211"/>
+          </w:tcPr>
+          <w:p>
+            <w:r>
+              <w:rPr>
+                <w:rFonts w:ascii="Microsoft YaHei" w:hAnsi="Microsoft YaHei" w:eastAsia="Microsoft YaHei"/>
+              </w:rPr>
+              <w:t>外部部署事项，未伪装为已验证</w:t>
+            </w:r>
+          </w:p>
+        </w:tc>
+      </w:tr>
+    </w:tbl>
     <w:sectPr>
       <w:pgSz w:w="12240" w:h="15840"/>
       <w:pgMar w:top="1247" w:right="1247" w:bottom="1134" w:left="1361" w:header="720" w:footer="720" w:gutter="0"/>

</xml_diff>